<commit_message>
docs(qms): correct recording-consent gap in EM26-35, R-15 and AIA-01
The application does show the operator a recording indicator
('Listening…', 'Recording in Boardroom Mode…', elapsed time —
frontend/components/LiveTranscription.tsx, BoardroomView.tsx). The
earlier search looked in frontend/src, which does not exist. The gap is
restated as no consent step and no notice for the other participants.
Rating, owner and due date unchanged; correction noted in AR-2026-008.

Co-Authored-By: Claude Opus 5.5 <noreply@anthropic.com>
</commit_message>
<xml_diff>
--- a/docs/qms/evidence-2026/20_AI_Impact_Assessment/EM26-35_AI_Impact_Assessment_EchoMind.docx
+++ b/docs/qms/evidence-2026/20_AI_Impact_Assessment/EM26-35_AI_Impact_Assessment_EchoMind.docx
@@ -2554,7 +2554,7 @@
                 <w:sz w:val="17"/>
                 <w:szCs w:val="17"/>
               </w:rPr>
-              <w:t xml:space="preserve">Recording only starts on a user action</w:t>
+              <w:t xml:space="preserve">Recording only starts on a user action; the operator sees ‘Listening…’ or ‘Recording in Boardroom Mode…’ with the elapsed time</w:t>
             </w:r>
           </w:p>
         </w:tc>
@@ -2583,7 +2583,7 @@
                 <w:sz w:val="17"/>
                 <w:szCs w:val="17"/>
               </w:rPr>
-              <w:t xml:space="preserve">Code review 2026-10-20: no on-screen recording notice or consent step</w:t>
+              <w:t xml:space="preserve">Code review 2026-10-20: frontend/components/LiveTranscription.tsx, BoardroomView.tsx — operator indicator only</w:t>
             </w:r>
           </w:p>
         </w:tc>
@@ -2612,7 +2612,7 @@
                 <w:sz w:val="17"/>
                 <w:szCs w:val="17"/>
               </w:rPr>
-              <w:t xml:space="preserve">No notice to participants; no customer guidance on consent</w:t>
+              <w:t xml:space="preserve">No consent step; nothing tells the other participants; no customer guidance on consent</w:t>
             </w:r>
           </w:p>
         </w:tc>
@@ -8030,7 +8030,7 @@
                 <w:sz w:val="17"/>
                 <w:szCs w:val="17"/>
               </w:rPr>
-              <w:t xml:space="preserve">Show a clear ‘recording’ indicator in live transcription and Boardroom; add consent guidance for customers to the user manual</w:t>
+              <w:t xml:space="preserve">Add a consent step when live transcription or Boardroom starts (the operator confirms participants have been told) and an optional notice for participants; add consent guidance for customers to the user manual</w:t>
             </w:r>
           </w:p>
         </w:tc>
@@ -9317,7 +9317,7 @@
         <w:spacing w:after="100"/>
       </w:pPr>
       <w:r>
-        <w:t xml:space="preserve">EchoMind supports people with information and does not make automated decisions about them. The main impacts — data protection, client confidentiality and accuracy — are controlled and measured. The assessment found one high-rated gap (people being recorded are not told) and four medium gaps (abstention, bias not measured, over-reliance guidance, licences). Each has an owner and a date; recording notice and consent guidance come first.</w:t>
+        <w:t xml:space="preserve">EchoMind supports people with information and does not make automated decisions about them. The main impacts — data protection, client confidentiality and accuracy — are controlled and measured. The assessment found one high-rated gap (no consent step or notice for the people being recorded) and four medium gaps (abstention, bias not measured, over-reliance guidance, licences). Each has an owner and a date; the consent step and participant notice come first.</w:t>
       </w:r>
     </w:p>
     <w:p>

</xml_diff>